<commit_message>
Enrich module 2 lead exercise with CRM history
</commit_message>
<xml_diff>
--- a/materials/budmax_lead_email.docx
+++ b/materials/budmax_lead_email.docx
@@ -1,6 +1,6 @@
 
 <file path=word/document.xml><?xml version="1.0" encoding="utf-8"?>
-<w:document xmlns:wpc="http://schemas.microsoft.com/office/word/2010/wordprocessingCanvas" xmlns:mo="http://schemas.microsoft.com/office/mac/office/2008/main" xmlns:mc="http://schemas.openxmlformats.org/markup-compatibility/2006" xmlns:mv="urn:schemas-microsoft-com:mac:vml" xmlns:o="urn:schemas-microsoft-com:office:office" xmlns:r="http://schemas.openxmlformats.org/officeDocument/2006/relationships" xmlns:m="http://schemas.openxmlformats.org/officeDocument/2006/math" xmlns:v="urn:schemas-microsoft-com:vml" xmlns:wp14="http://schemas.microsoft.com/office/word/2010/wordprocessingDrawing" xmlns:wp="http://schemas.openxmlformats.org/drawingml/2006/wordprocessingDrawing" xmlns:w10="urn:schemas-microsoft-com:office:word" xmlns:w="http://schemas.openxmlformats.org/wordprocessingml/2006/main" xmlns:w14="http://schemas.microsoft.com/office/word/2010/wordml" xmlns:wpg="http://schemas.microsoft.com/office/word/2010/wordprocessingGroup" xmlns:wpi="http://schemas.microsoft.com/office/word/2010/wordprocessingInk" xmlns:wne="http://schemas.microsoft.com/office/word/2006/wordml" xmlns:wps="http://schemas.microsoft.com/office/word/2010/wordprocessingShape" mc:Ignorable="w14 wp14">
+<w:document xmlns:ns1="http://schemas.openxmlformats.org/markup-compatibility/2006" xmlns:r="http://schemas.openxmlformats.org/officeDocument/2006/relationships" xmlns:w="http://schemas.openxmlformats.org/wordprocessingml/2006/main" ns1:Ignorable="w14 wp14">
   <w:body>
     <w:p>
       <w:pPr>
@@ -27,7 +27,7 @@
           <w:color w:val="203044"/>
           <w:sz w:val="21"/>
         </w:rPr>
-        <w:t>Temat: Zapytanie o najem aut dla handlowców</w:t>
+        <w:t>Temat: Prośba o propozycję floty na nowy okres</w:t>
       </w:r>
     </w:p>
     <w:p>
@@ -41,7 +41,247 @@
           <w:color w:val="203044"/>
           <w:sz w:val="21"/>
         </w:rPr>
-        <w:t>Dzień dobry, jesteśmy firmą BudMax Instalacje Sp. z o.o. (ok. 140 pracowników, instalacje HVAC, działamy w całej Polsce). Szukamy 12 samochodów dla przedstawicieli handlowych, którzy robią ok. 45 tys. km rocznie, oraz 2 aut dla zarządu. Polityka flotowa: kombi lub SUV klasy C, hybryda lub benzyna, budżet do 2 400 zł netto/mies. za auto handlowca, dla zarządu do 4 200 zł. Ważny jest duży bagażnik (wozimy próbki i katalogi), hak nie jest potrzebny. Okres 48 miesięcy. Obecnie mamy auta w leasingu, który kończy się w lutym. Prosimy o propozycję do końca miesiąca.</w:t>
+        <w:t xml:space="preserve">Dzień dobry,</w:t>
+      </w:r>
+      <w:r>
+        <w:br/>
+      </w:r>
+      <w:r>
+        <w:rPr>
+          <w:rFonts w:ascii="Arial" w:hAnsi="Arial"/>
+          <w:b/>
+          <w:color w:val="000000"/>
+          <w:sz w:val="46"/>
+        </w:rPr>
+        <w:t>Mail leadowy BudMax</w:t>
+      </w:r>
+    </w:p>
+    <w:p>
+      <w:pPr>
+        <w:spacing w:after="240"/>
+      </w:pPr>
+      <w:r>
+        <w:rPr>
+          <w:rFonts w:ascii="Arial" w:hAnsi="Arial"/>
+          <w:b/>
+          <w:color w:val="203044"/>
+          <w:sz w:val="21"/>
+        </w:rPr>
+        <w:t>Temat: Prośba o propozycję floty na nowy okres</w:t>
+      </w:r>
+    </w:p>
+    <w:p>
+      <w:pPr>
+        <w:spacing w:after="240"/>
+      </w:pPr>
+      <w:r>
+        <w:rPr>
+          <w:rFonts w:ascii="Arial" w:hAnsi="Arial"/>
+          <w:b w:val="0"/>
+          <w:color w:val="203044"/>
+          <w:sz w:val="21"/>
+        </w:rPr>
+        <w:t xml:space="preserve">wracam do tematu samochodów dla naszych zespołów. BudMax Instalacje Sp. z o.o. zatrudnia około 140 osób i prowadzi działalność HVAC w całej Polsce.</w:t>
+      </w:r>
+      <w:r>
+        <w:br/>
+      </w:r>
+      <w:r>
+        <w:rPr>
+          <w:rFonts w:ascii="Arial" w:hAnsi="Arial"/>
+          <w:b/>
+          <w:color w:val="000000"/>
+          <w:sz w:val="46"/>
+        </w:rPr>
+        <w:t>Mail leadowy BudMax</w:t>
+      </w:r>
+    </w:p>
+    <w:p>
+      <w:pPr>
+        <w:spacing w:after="240"/>
+      </w:pPr>
+      <w:r>
+        <w:rPr>
+          <w:rFonts w:ascii="Arial" w:hAnsi="Arial"/>
+          <w:b/>
+          <w:color w:val="203044"/>
+          <w:sz w:val="21"/>
+        </w:rPr>
+        <w:t>Temat: Prośba o propozycję floty na nowy okres</w:t>
+      </w:r>
+    </w:p>
+    <w:p>
+      <w:pPr>
+        <w:spacing w:after="240"/>
+      </w:pPr>
+      <w:r>
+        <w:rPr>
+          <w:rFonts w:ascii="Arial" w:hAnsi="Arial"/>
+          <w:b w:val="0"/>
+          <w:color w:val="203044"/>
+          <w:sz w:val="21"/>
+        </w:rPr>
+        <w:t xml:space="preserve"/>
+      </w:r>
+      <w:r>
+        <w:br/>
+      </w:r>
+      <w:r>
+        <w:rPr>
+          <w:rFonts w:ascii="Arial" w:hAnsi="Arial"/>
+          <w:b/>
+          <w:color w:val="000000"/>
+          <w:sz w:val="46"/>
+        </w:rPr>
+        <w:t>Mail leadowy BudMax</w:t>
+      </w:r>
+    </w:p>
+    <w:p>
+      <w:pPr>
+        <w:spacing w:after="240"/>
+      </w:pPr>
+      <w:r>
+        <w:rPr>
+          <w:rFonts w:ascii="Arial" w:hAnsi="Arial"/>
+          <w:b/>
+          <w:color w:val="203044"/>
+          <w:sz w:val="21"/>
+        </w:rPr>
+        <w:t>Temat: Prośba o propozycję floty na nowy okres</w:t>
+      </w:r>
+    </w:p>
+    <w:p>
+      <w:pPr>
+        <w:spacing w:after="240"/>
+      </w:pPr>
+      <w:r>
+        <w:rPr>
+          <w:rFonts w:ascii="Arial" w:hAnsi="Arial"/>
+          <w:b w:val="0"/>
+          <w:color w:val="203044"/>
+          <w:sz w:val="21"/>
+        </w:rPr>
+        <w:t xml:space="preserve">Na dziś planujemy 12 aut dla handlowców i 2 auta dla zarządu. Przedstawiciele pracują w całym kraju; wstępnie liczymy około 45 tys. km rocznie, ale nie mam jeszcze zestawienia dla poszczególnych samochodów. W naszej polityce pojawia się kombi albo SUV klasy C oraz napęd benzynowy lub hybrydowy. To na razie preferencje — nie wszystkie warianty mamy zatwierdzone. Duży bagażnik jest ważny, bo handlowcy wożą próbki i katalogi; hak nie będzie potrzebny.</w:t>
+      </w:r>
+      <w:r>
+        <w:br/>
+      </w:r>
+      <w:r>
+        <w:rPr>
+          <w:rFonts w:ascii="Arial" w:hAnsi="Arial"/>
+          <w:b/>
+          <w:color w:val="000000"/>
+          <w:sz w:val="46"/>
+        </w:rPr>
+        <w:t>Mail leadowy BudMax</w:t>
+      </w:r>
+    </w:p>
+    <w:p>
+      <w:pPr>
+        <w:spacing w:after="240"/>
+      </w:pPr>
+      <w:r>
+        <w:rPr>
+          <w:rFonts w:ascii="Arial" w:hAnsi="Arial"/>
+          <w:b/>
+          <w:color w:val="203044"/>
+          <w:sz w:val="21"/>
+        </w:rPr>
+        <w:t>Temat: Prośba o propozycję floty na nowy okres</w:t>
+      </w:r>
+    </w:p>
+    <w:p>
+      <w:pPr>
+        <w:spacing w:after="240"/>
+      </w:pPr>
+      <w:r>
+        <w:rPr>
+          <w:rFonts w:ascii="Arial" w:hAnsi="Arial"/>
+          <w:b w:val="0"/>
+          <w:color w:val="203044"/>
+          <w:sz w:val="21"/>
+        </w:rPr>
+        <w:t xml:space="preserve"/>
+      </w:r>
+      <w:r>
+        <w:br/>
+      </w:r>
+      <w:r>
+        <w:rPr>
+          <w:rFonts w:ascii="Arial" w:hAnsi="Arial"/>
+          <w:b/>
+          <w:color w:val="000000"/>
+          <w:sz w:val="46"/>
+        </w:rPr>
+        <w:t>Mail leadowy BudMax</w:t>
+      </w:r>
+    </w:p>
+    <w:p>
+      <w:pPr>
+        <w:spacing w:after="240"/>
+      </w:pPr>
+      <w:r>
+        <w:rPr>
+          <w:rFonts w:ascii="Arial" w:hAnsi="Arial"/>
+          <w:b/>
+          <w:color w:val="203044"/>
+          <w:sz w:val="21"/>
+        </w:rPr>
+        <w:t>Temat: Prośba o propozycję floty na nowy okres</w:t>
+      </w:r>
+    </w:p>
+    <w:p>
+      <w:pPr>
+        <w:spacing w:after="240"/>
+      </w:pPr>
+      <w:r>
+        <w:rPr>
+          <w:rFonts w:ascii="Arial" w:hAnsi="Arial"/>
+          <w:b w:val="0"/>
+          <w:color w:val="203044"/>
+          <w:sz w:val="21"/>
+        </w:rPr>
+        <w:t xml:space="preserve">Obecne auta są w leasingu, który kończy się w lutym. Nie ustaliliśmy jeszcze, czy wymiana wszystkich samochodów ma nastąpić jednego dnia. Być może zaczniemy od kilku aut wcześniej, jeśli terminy dostaw będą długie. Prosimy o pierwszą propozycję do końca miesiąca, żebyśmy mogli przejrzeć warianty. Umowa miałaby trwać 48 miesięcy.</w:t>
+      </w:r>
+      <w:r>
+        <w:br/>
+      </w:r>
+      <w:r>
+        <w:rPr>
+          <w:rFonts w:ascii="Arial" w:hAnsi="Arial"/>
+          <w:b/>
+          <w:color w:val="000000"/>
+          <w:sz w:val="46"/>
+        </w:rPr>
+        <w:t>Mail leadowy BudMax</w:t>
+      </w:r>
+    </w:p>
+    <w:p>
+      <w:pPr>
+        <w:spacing w:after="240"/>
+      </w:pPr>
+      <w:r>
+        <w:rPr>
+          <w:rFonts w:ascii="Arial" w:hAnsi="Arial"/>
+          <w:b/>
+          <w:color w:val="203044"/>
+          <w:sz w:val="21"/>
+        </w:rPr>
+        <w:t>Temat: Prośba o propozycję floty na nowy okres</w:t>
+      </w:r>
+    </w:p>
+    <w:p>
+      <w:pPr>
+        <w:spacing w:after="240"/>
+      </w:pPr>
+      <w:r>
+        <w:rPr>
+          <w:rFonts w:ascii="Arial" w:hAnsi="Arial"/>
+          <w:b w:val="0"/>
+          <w:color w:val="203044"/>
+          <w:sz w:val="21"/>
+        </w:rPr>
+        <w:t xml:space="preserve">Budżet na auto handlowca to do 2 400 zł netto miesięcznie. Dla auta zarządu zakładamy do 4 200 zł miesięcznie, ale muszę jeszcze potwierdzić, czy chodzi o kwotę netto czy brutto.</w:t>
       </w:r>
     </w:p>
     <w:p>

</xml_diff>